<commit_message>
Actualiza el manual de Bodega y Despacho
Rutas de despacho con zonas, cola de todas las series salvo Ferias, ingreso
manual con supervisor, etiqueta automática, manifiesto corregible, comprobante
de entrega y recibo de mercadería. Las capturas siguen siendo de la versión
anterior y el manual lo avisa.

Co-Authored-By: Claude Sonnet 5.5 <noreply@anthropic.com>
</commit_message>
<xml_diff>
--- a/docs/manual-bodega/Manual-SeePOS-Bodega-y-Despacho.docx
+++ b/docs/manual-bodega/Manual-SeePOS-Bodega-y-Despacho.docx
@@ -44,7 +44,7 @@
           <w:color w:val="EE7519"/>
           <w:sz w:val="28"/>
         </w:rPr>
-        <w:t>Cola de alistamiento, empaque, manifiesto y entrega</w:t>
+        <w:t>Cola de alistamiento, empaque, manifiesto, entrega y recibo de devoluciones</w:t>
       </w:r>
     </w:p>
     <w:p>
@@ -100,6 +100,40 @@
     </w:p>
     <w:p>
       <w:pPr>
+        <w:spacing w:before="160" w:after="40"/>
+        <w:ind w:left="170"/>
+        <w:shd w:fill="FFF4EA" w:val="clear"/>
+      </w:pPr>
+      <w:r>
+        <w:rPr>
+          <w:rFonts w:ascii="Calibri" w:hAnsi="Calibri" w:eastAsia="Calibri"/>
+          <w:b/>
+          <w:i w:val="0"/>
+          <w:color w:val="1072A9"/>
+          <w:sz w:val="22"/>
+        </w:rPr>
+        <w:t>Sobre las capturas</w:t>
+      </w:r>
+    </w:p>
+    <w:p>
+      <w:pPr>
+        <w:spacing w:after="200"/>
+        <w:ind w:left="170"/>
+        <w:shd w:fill="FFF4EA" w:val="clear"/>
+      </w:pPr>
+      <w:r>
+        <w:rPr>
+          <w:rFonts w:ascii="Calibri" w:hAnsi="Calibri" w:eastAsia="Calibri"/>
+          <w:b w:val="0"/>
+          <w:i w:val="0"/>
+          <w:color w:val="1F2A37"/>
+          <w:sz w:val="21"/>
+        </w:rPr>
+        <w:t>Las imágenes se tomaron antes de las últimas mejoras (rutas con zonas, ingreso manual con supervisor, manifiesto editable, comprobante de entrega y recibo de mercadería). El texto de cada sección sí está actualizado; las pantallas nuevas se describen sin captura.</w:t>
+      </w:r>
+    </w:p>
+    <w:p>
+      <w:pPr>
         <w:spacing w:before="320" w:after="120"/>
         <w:pBdr>
           <w:bottom w:val="single" w:sz="12" w:space="4" w:color="1072A9"/>
@@ -128,7 +162,7 @@
           <w:color w:val="1F2A37"/>
           <w:sz w:val="22"/>
         </w:rPr>
-        <w:t>El menú Bodega agrupa cinco pantallas. Se recorren en este orden operativo:</w:t>
+        <w:t>El menú Bodega agrupa seis pantallas. Se recorren en este orden operativo:</w:t>
       </w:r>
     </w:p>
     <w:p>
@@ -182,7 +216,7 @@
           <w:color w:val="1F2A37"/>
           <w:sz w:val="22"/>
         </w:rPr>
-        <w:t>zona, vehículo y chofer del camión. Distinto de la ruta comercial del vendedor.</w:t>
+        <w:t>rutas de despacho con las zonas que cubren, más vehículos y choferes. Solo el encargado de bodega crea rutas. Distinto de la ruta comercial del vendedor (comisiones).</w:t>
       </w:r>
     </w:p>
     <w:p>
@@ -209,7 +243,34 @@
           <w:color w:val="1F2A37"/>
           <w:sz w:val="22"/>
         </w:rPr>
-        <w:t>las facturas y preventas pendientes de recoger. El tiquete de mostrador no entra solo.</w:t>
+        <w:t>las facturas, tiquetes, consignaciones y preventas pendientes de recoger. Entran todas las series, salvo la de Ferias.</w:t>
+      </w:r>
+    </w:p>
+    <w:p>
+      <w:pPr>
+        <w:pStyle w:val="ListBullet"/>
+        <w:spacing w:after="80"/>
+        <w:ind w:left="567"/>
+      </w:pPr>
+      <w:r>
+        <w:rPr>
+          <w:rFonts w:ascii="Calibri" w:hAnsi="Calibri" w:eastAsia="Calibri"/>
+          <w:b/>
+          <w:i w:val="0"/>
+          <w:color w:val="1F2A37"/>
+          <w:sz w:val="22"/>
+        </w:rPr>
+        <w:t xml:space="preserve">Recibo de mercadería. </w:t>
+      </w:r>
+      <w:r>
+        <w:rPr>
+          <w:rFonts w:ascii="Calibri" w:hAnsi="Calibri" w:eastAsia="Calibri"/>
+          <w:b w:val="0"/>
+          <w:i w:val="0"/>
+          <w:color w:val="1F2A37"/>
+          <w:sz w:val="22"/>
+        </w:rPr>
+        <w:t>la mercadería devuelta por clientes: el inventario sube cuando bodega confirma lo que recibió.</w:t>
       </w:r>
     </w:p>
     <w:p>
@@ -529,7 +590,9 @@
           <w:color w:val="1F2A37"/>
           <w:sz w:val="22"/>
         </w:rPr>
-        <w:t>Bodega → Rutas de entrega. Son tres listas independientes. La zona de despacho no es la ruta comercial del SAC. En el ejemplo: zona San José Centro, placa SJO-001, chofer Carlos Pérez.</w:t>
+        <w:t>Bodega → Rutas de entrega. Son tres listas independientes. La ruta de despacho no es la ruta comercial del SAC. En el ejemplo: ruta San José Centro, placa SJO-001, chofer Carlos Pérez.</w:t>
+        <w:br/>
+        <w:t>Cada ruta tiene un nombre, una casilla Activa y las zonas que cubre: una provincia completa, o un cantón o distrito concreto; puede ser de varias provincias o de una zona específica. Solo el encargado de bodega (permiso Crear/Editar) crea y modifica rutas; el despachador solo las elige en Despacho, y solo ve las activas. Una ruta inactiva ya no se ofrece pero no se pierde.</w:t>
       </w:r>
     </w:p>
     <w:p>
@@ -618,7 +681,9 @@
           <w:color w:val="1F2A37"/>
           <w:sz w:val="22"/>
         </w:rPr>
-        <w:t>Al emitir una factura (contado o crédito) o guardar una preventa, la orden entra sola en Pendiente. El tiquete de mostrador y la consignación no entran. Si una factura ya emitida no apareció, use Traer factura con el número o el id de la venta y pulse Crear.</w:t>
+        <w:t>Al emitir una factura (contado o crédito), un tiquete, una consignación o guardar una preventa, la orden entra sola en Pendiente. Entran todas las series, salvo la marcada «Sin alistamiento» en Parámetros → Series (la de Ferias, de entrega inmediata). Si una factura ya emitida no apareció, use Traer factura con el número o el id de la venta y pulse Crear.</w:t>
+        <w:br/>
+        <w:t>La cola solo muestra las órdenes de la sucursal de su sesión. La columna Espera indica cuánto lleva la orden desde la facturación (o cuánto tardó bodega en iniciarla): verde, amarillo o rojo según los minutos configurados. Puede filtrar por estado, tipo, prioridad (alta = crédito) y documento (factura o tiquete).</w:t>
       </w:r>
     </w:p>
     <w:p>
@@ -674,7 +739,7 @@
           <w:color w:val="5C5C5C"/>
           <w:sz w:val="19"/>
         </w:rPr>
-        <w:t>Figura 5. Cola vacía. El subtítulo lo recuerda: el tiquete de mostrador no entra.</w:t>
+        <w:t>Figura 5. Cola vacía (captura de la versión anterior).</w:t>
       </w:r>
     </w:p>
     <w:p>
@@ -1070,7 +1135,9 @@
           <w:color w:val="1F2A37"/>
           <w:sz w:val="22"/>
         </w:rPr>
-        <w:t>Pistola USB o colectora en Pistola / código. Si la barra está dañada, escriba el código del artículo (002) o el EAN. El lote escaneado tiene que ser el de la factura. Una etiqueta GS1 puede traer lote (AI 10) y cantidad (AI 37) y cubre la línea de un disparo. En el ejemplo, un GS1 con cantidad 10 dejó la línea Completa (10,000 / 10,000).</w:t>
+        <w:t>Pistola USB o colectora en Pistola / código. El lote escaneado tiene que ser el de la factura. Una etiqueta GS1 puede traer lote (AI 10) y cantidad (AI 37) y cubre la línea de un disparo. En el ejemplo, un GS1 con cantidad 10 dejó la línea Completa (10,000 / 10,000). Se bloquea un lote vencido (el del código o el de la factura) o con menos vida útil de la que exige el cliente.</w:t>
+        <w:br/>
+        <w:t>Si la barra está dañada, o la etiqueta no trae lote, use Ingreso manual (supervisor): escriba el código del artículo y pida al supervisor su clave interna. Solo vale un usuario cuyo perfil tenga la opción «Supervisor de bodega». En el ingreso manual el lote es siempre el de la factura (no se puede elegir otro) y el escaneo queda registrado con quién autorizó. Los artículos sin ningún código de barras registrado se siguen identificando por su código, sin supervisor.</w:t>
       </w:r>
     </w:p>
     <w:p>
@@ -1110,7 +1177,7 @@
           <w:color w:val="1F2A37"/>
           <w:sz w:val="22"/>
         </w:rPr>
-        <w:t>Indique el peso en kg y pulse Cerrar bulto: el bulto queda Cerrado (BULT-1) y se puede imprimir etiqueta A4 o 80 mm. Cuando todas las líneas están Completas, pulse Marcar empacado. SeePOS avisa: pase a Despacho para armar el manifiesto.</w:t>
+        <w:t>Indique el peso en kg y pulse Cerrar bulto: el bulto queda Cerrado (BULT-1) y se abre la etiqueta para imprimir (A4 u 80 mm desde la lista de bultos). Al completar el 100 % de lo facturado, SeePOS cierra el bulto abierto y abre la etiqueta solo. Cuando todas las líneas están Completas, pulse Marcar empacado: los bultos que seguían abiertos se cierran y se imprimen. SeePOS avisa: pase a Despacho para armar el manifiesto.</w:t>
       </w:r>
     </w:p>
     <w:p>
@@ -1370,7 +1437,9 @@
           <w:color w:val="1F2A37"/>
           <w:sz w:val="22"/>
         </w:rPr>
-        <w:t>Bodega → Despacho. Marque los bultos empacados sin manifiesto (BULT-1 · factura 6). Elija ruta, vehículo y chofer. Pulse Crear manifiesto. SeePOS abre el PDF del manifiesto.</w:t>
+        <w:t>Bodega → Despacho. Marque los bultos empacados sin manifiesto (BULT-1 · factura 6). Elija la ruta (obligatoria; solo aparecen las activas), el vehículo y el chofer. Pulse Crear manifiesto. SeePOS abre el PDF del manifiesto.</w:t>
+        <w:br/>
+        <w:t>Cada bulto muestra la zona y la dirección de su cliente. Con una ruta elegida puede marcar «Solo bultos de la ruta» para ver únicamente los que caen en sus zonas; si carga un bulto fuera de las zonas, SeePOS lo avisa pero no lo impide: la decisión es del despachador. Si no hay rutas activas, pida al encargado de bodega que cree una.</w:t>
       </w:r>
     </w:p>
     <w:p>
@@ -1466,7 +1535,41 @@
           <w:color w:val="1F2A37"/>
           <w:sz w:val="22"/>
         </w:rPr>
-        <w:t>En el manifiesto pulse el campo Escanear bulto al camión y dispare el código BULT-n (o escríbalo). Hay que cargar todos los bultos del manifiesto. Luego pulse Salir a ruta. La orden pasa a En ruta.</w:t>
+        <w:t>En el manifiesto pulse el campo Escanear bulto al camión y dispare el código BULT-n (o escríbalo). Hay que cargar todos los bultos del manifiesto, y el manifiesto debe tener ruta. Luego pulse Salir a ruta. La orden pasa a En ruta.</w:t>
+      </w:r>
+    </w:p>
+    <w:p>
+      <w:pPr>
+        <w:spacing w:before="160" w:after="40"/>
+        <w:ind w:left="170"/>
+        <w:shd w:fill="FFF4EA" w:val="clear"/>
+      </w:pPr>
+      <w:r>
+        <w:rPr>
+          <w:rFonts w:ascii="Calibri" w:hAnsi="Calibri" w:eastAsia="Calibri"/>
+          <w:b/>
+          <w:i w:val="0"/>
+          <w:color w:val="1072A9"/>
+          <w:sz w:val="22"/>
+        </w:rPr>
+        <w:t>Corregir un manifiesto antes de salir</w:t>
+      </w:r>
+    </w:p>
+    <w:p>
+      <w:pPr>
+        <w:spacing w:after="200"/>
+        <w:ind w:left="170"/>
+        <w:shd w:fill="FFF4EA" w:val="clear"/>
+      </w:pPr>
+      <w:r>
+        <w:rPr>
+          <w:rFonts w:ascii="Calibri" w:hAnsi="Calibri" w:eastAsia="Calibri"/>
+          <w:b w:val="0"/>
+          <w:i w:val="0"/>
+          <w:color w:val="1F2A37"/>
+          <w:sz w:val="21"/>
+        </w:rPr>
+        <w:t>Mientras el manifiesto esté Armado se puede cambiar la ruta, el vehículo y el chofer (Guardar cambios), quitar un bulto (queda libre para otro manifiesto) o anular el manifiesto con un motivo. Una vez que sale a ruta ya no se puede corregir.</w:t>
       </w:r>
     </w:p>
     <w:p>
@@ -1636,7 +1739,7 @@
           <w:color w:val="1F2A37"/>
           <w:sz w:val="22"/>
         </w:rPr>
-        <w:t>Desde Empaque (o desde Despacho, factura por factura) pulse Entregado. Indique quién recibió. La firma en el recuadro es opcional: rastro de quién recibió, no certificado legal. Pulse Confirmar.</w:t>
+        <w:t>Desde Empaque (o desde Despacho, factura por factura) pulse Entregado. Indique quién recibió. La firma en el recuadro es opcional: rastro de quién recibió, no certificado legal. Pulse Confirmar. Con la orden cerrada puede imprimir el Comprobante de entrega (qué se entregó, quién recibió, ruta, vehículo y chofer, y una línea para la firma a mano) desde Empaque o desde el manifiesto en Despacho.</w:t>
       </w:r>
     </w:p>
     <w:p>
@@ -1800,7 +1903,114 @@
           <w:color w:val="1072A9"/>
           <w:sz w:val="32"/>
         </w:rPr>
-        <w:t>7. Resumen para el mostrador de bodega</w:t>
+        <w:t>7. Recibo de mercadería (devoluciones)</w:t>
+      </w:r>
+    </w:p>
+    <w:p>
+      <w:pPr>
+        <w:spacing w:after="160" w:line="276" w:lineRule="auto"/>
+      </w:pPr>
+      <w:r>
+        <w:rPr>
+          <w:rFonts w:ascii="Calibri" w:hAnsi="Calibri" w:eastAsia="Calibri"/>
+          <w:b w:val="0"/>
+          <w:i w:val="0"/>
+          <w:color w:val="1F2A37"/>
+          <w:sz w:val="22"/>
+        </w:rPr>
+        <w:t>Cuando se emite una devolución de venta con mercadería (nota de crédito o devolución interna), el inventario no sube de inmediato: la devolución entra a Bodega → Recibo de mercadería como una orden Pendiente de recibo.</w:t>
+      </w:r>
+    </w:p>
+    <w:p>
+      <w:pPr>
+        <w:spacing w:before="160" w:after="80"/>
+      </w:pPr>
+      <w:r>
+        <w:rPr>
+          <w:rFonts w:ascii="Calibri" w:hAnsi="Calibri" w:eastAsia="Calibri"/>
+          <w:b/>
+          <w:i w:val="0"/>
+          <w:color w:val="EE7519"/>
+          <w:sz w:val="24"/>
+        </w:rPr>
+        <w:t xml:space="preserve">Paso 10. </w:t>
+      </w:r>
+      <w:r>
+        <w:rPr>
+          <w:rFonts w:ascii="Calibri" w:hAnsi="Calibri" w:eastAsia="Calibri"/>
+          <w:b/>
+          <w:i w:val="0"/>
+          <w:color w:val="1F2A37"/>
+          <w:sz w:val="24"/>
+        </w:rPr>
+        <w:t>Recibir la mercadería</w:t>
+      </w:r>
+    </w:p>
+    <w:p>
+      <w:pPr>
+        <w:spacing w:after="160" w:line="276" w:lineRule="auto"/>
+      </w:pPr>
+      <w:r>
+        <w:rPr>
+          <w:rFonts w:ascii="Calibri" w:hAnsi="Calibri" w:eastAsia="Calibri"/>
+          <w:b w:val="0"/>
+          <w:i w:val="0"/>
+          <w:color w:val="1F2A37"/>
+          <w:sz w:val="22"/>
+        </w:rPr>
+        <w:t>Abra la orden con Recibir. Verá el cliente, la factura, las líneas con su lote y bodega, y la cantidad devuelta. Escriba la cantidad realmente recibida de cada línea (por defecto, lo devuelto; no puede ser mayor) y pulse Confirmar recibo. Solo entonces el inventario sube, y por lo recibido. Si se recibe menos de lo devuelto, la diferencia queda anotada como faltante.</w:t>
+      </w:r>
+    </w:p>
+    <w:p>
+      <w:pPr>
+        <w:spacing w:before="160" w:after="40"/>
+        <w:ind w:left="170"/>
+        <w:shd w:fill="FFF4EA" w:val="clear"/>
+      </w:pPr>
+      <w:r>
+        <w:rPr>
+          <w:rFonts w:ascii="Calibri" w:hAnsi="Calibri" w:eastAsia="Calibri"/>
+          <w:b/>
+          <w:i w:val="0"/>
+          <w:color w:val="1072A9"/>
+          <w:sz w:val="22"/>
+        </w:rPr>
+        <w:t>Anular y excepciones</w:t>
+      </w:r>
+    </w:p>
+    <w:p>
+      <w:pPr>
+        <w:spacing w:after="200"/>
+        <w:ind w:left="170"/>
+        <w:shd w:fill="FFF4EA" w:val="clear"/>
+      </w:pPr>
+      <w:r>
+        <w:rPr>
+          <w:rFonts w:ascii="Calibri" w:hAnsi="Calibri" w:eastAsia="Calibri"/>
+          <w:b w:val="0"/>
+          <w:i w:val="0"/>
+          <w:color w:val="1F2A37"/>
+          <w:sz w:val="21"/>
+        </w:rPr>
+        <w:t>Una orden pendiente se puede anular con un motivo (Anular orden): la mercadería no entra al inventario. Si se anula la devolución de origen mientras la orden sigue pendiente, la orden se anula sola; si ya se recibió, se revierte lo recibido. Los faltantes de alistamiento no pasan por recibo: esa mercadería nunca salió de bodega. Con Devoluciones:ExigirRecibo en false el inventario vuelve a subir al emitir la devolución.</w:t>
+      </w:r>
+    </w:p>
+    <w:p>
+      <w:pPr>
+        <w:spacing w:before="320" w:after="120"/>
+        <w:pBdr>
+          <w:bottom w:val="single" w:sz="12" w:space="4" w:color="1072A9"/>
+        </w:pBdr>
+      </w:pPr>
+      <w:r>
+        <w:rPr>
+          <w:rFonts w:ascii="Calibri" w:hAnsi="Calibri" w:eastAsia="Calibri"/>
+          <w:b/>
+          <w:i w:val="0"/>
+          <w:color w:val="1072A9"/>
+          <w:sz w:val="32"/>
+        </w:rPr>
+        <w:t>8. Resumen para el mostrador de bodega</w:t>
       </w:r>
     </w:p>
     <w:p>
@@ -1827,7 +2037,7 @@
           <w:color w:val="1F2A37"/>
           <w:sz w:val="22"/>
         </w:rPr>
-        <w:t>Ubicaciones y rutas se mantienen en catálogo; no se tocan en cada pedido.</w:t>
+        <w:t>Ubicaciones y rutas (con sus zonas) se mantienen en catálogo; las rutas las crea el encargado de bodega.</w:t>
       </w:r>
     </w:p>
     <w:p>
@@ -1854,7 +2064,7 @@
           <w:color w:val="1F2A37"/>
           <w:sz w:val="22"/>
         </w:rPr>
-        <w:t>La factura/preventa entra sola. Si no, Traer factura con el número o el id.</w:t>
+        <w:t>La venta entra sola, de cualquier serie salvo Ferias. Si no, Traer factura con el número o el id.</w:t>
       </w:r>
     </w:p>
     <w:p>
@@ -1881,7 +2091,7 @@
           <w:color w:val="1F2A37"/>
           <w:sz w:val="22"/>
         </w:rPr>
-        <w:t>Aceptar → escanear (lote de la factura) → cerrar bulto → marcar empacado.</w:t>
+        <w:t>Aceptar → escanear (lote de la factura; manual solo con supervisor) → la etiqueta sale al cerrar el bulto → marcar empacado.</w:t>
       </w:r>
     </w:p>
     <w:p>
@@ -1908,7 +2118,7 @@
           <w:color w:val="1F2A37"/>
           <w:sz w:val="22"/>
         </w:rPr>
-        <w:t>Elegir bultos + ruta/vehículo/chofer → crear manifiesto → escanear BULT-n → salir a ruta.</w:t>
+        <w:t>Elegir bultos + ruta/vehículo/chofer → crear manifiesto (se puede corregir) → escanear BULT-n → salir a ruta.</w:t>
       </w:r>
     </w:p>
     <w:p>
@@ -1935,7 +2145,34 @@
           <w:color w:val="1F2A37"/>
           <w:sz w:val="22"/>
         </w:rPr>
-        <w:t>Entregado pide quién recibió. No entregado corrige el documento (NC o preventa).</w:t>
+        <w:t>Entregado pide quién recibió y permite imprimir el comprobante. No entregado corrige el documento (NC o preventa).</w:t>
+      </w:r>
+    </w:p>
+    <w:p>
+      <w:pPr>
+        <w:pStyle w:val="ListBullet"/>
+        <w:spacing w:after="80"/>
+        <w:ind w:left="567"/>
+      </w:pPr>
+      <w:r>
+        <w:rPr>
+          <w:rFonts w:ascii="Calibri" w:hAnsi="Calibri" w:eastAsia="Calibri"/>
+          <w:b/>
+          <w:i w:val="0"/>
+          <w:color w:val="1F2A37"/>
+          <w:sz w:val="22"/>
+        </w:rPr>
+        <w:t xml:space="preserve">Devoluciones. </w:t>
+      </w:r>
+      <w:r>
+        <w:rPr>
+          <w:rFonts w:ascii="Calibri" w:hAnsi="Calibri" w:eastAsia="Calibri"/>
+          <w:b w:val="0"/>
+          <w:i w:val="0"/>
+          <w:color w:val="1F2A37"/>
+          <w:sz w:val="22"/>
+        </w:rPr>
+        <w:t>Las devoluciones se reciben en Recibo de mercadería; el inventario sube por lo recibido.</w:t>
       </w:r>
     </w:p>
     <w:p>
@@ -1953,7 +2190,7 @@
           <w:color w:val="1072A9"/>
           <w:sz w:val="32"/>
         </w:rPr>
-        <w:t>8. Qué no hacer</w:t>
+        <w:t>9. Qué no hacer</w:t>
       </w:r>
     </w:p>
     <w:p>
@@ -2004,7 +2241,7 @@
           <w:color w:val="1F2A37"/>
           <w:sz w:val="22"/>
         </w:rPr>
-        <w:t>Meter un tiquete de mostrador a la cola salvo que de verdad haya que alistar (Traer factura).</w:t>
+        <w:t>Pedir a un compañero sin perfil de supervisor que «autorice» el ingreso manual: la clave debe ser de un supervisor de bodega.</w:t>
       </w:r>
     </w:p>
     <w:p>
@@ -2021,7 +2258,24 @@
           <w:color w:val="1F2A37"/>
           <w:sz w:val="22"/>
         </w:rPr>
-        <w:t>Salir a ruta sin escanear todos los bultos del manifiesto.</w:t>
+        <w:t>Salir a ruta sin ruta o sin escanear todos los bultos del manifiesto.</w:t>
+      </w:r>
+    </w:p>
+    <w:p>
+      <w:pPr>
+        <w:pStyle w:val="ListBullet"/>
+        <w:spacing w:after="80"/>
+        <w:ind w:left="567"/>
+      </w:pPr>
+      <w:r>
+        <w:rPr>
+          <w:rFonts w:ascii="Calibri" w:hAnsi="Calibri" w:eastAsia="Calibri"/>
+          <w:b w:val="0"/>
+          <w:i w:val="0"/>
+          <w:color w:val="1F2A37"/>
+          <w:sz w:val="22"/>
+        </w:rPr>
+        <w:t>Confundir la ruta de despacho (a dónde va el camión) con la ruta comercial de Facturación (la de las comisiones).</w:t>
       </w:r>
     </w:p>
     <w:p>

</xml_diff>